<commit_message>
Lisa BD: add DARVO explanation section
Explain Deny, Attack, Reverse Victim and Offender with co-parenting
examples, leadership response table, and Faas 4 criteria. Regenerate DOCX.

Co-authored-by: reneealuste-commits <reneealuste-commits@users.noreply.github.com>
</commit_message>
<xml_diff>
--- a/opord/pereleptus/Maria-puhastusplaan.docx
+++ b/opord/pereleptus/Maria-puhastusplaan.docx
@@ -18,7 +18,7 @@
         <w:t xml:space="preserve">Renee Aluste</w:t>
       </w:r>
     </w:p>
-    <w:bookmarkStart w:id="42" w:name="X0c68996d9f47d95ebfd555de7a13c517665a12d"/>
+    <w:bookmarkStart w:id="46" w:name="X0c68996d9f47d95ebfd555de7a13c517665a12d"/>
     <w:p>
       <w:pPr>
         <w:pStyle w:val="Heading1"/>
@@ -42,7 +42,20 @@
         <w:t xml:space="preserve"> </w:t>
       </w:r>
       <w:r>
-        <w:t xml:space="preserve">nelja faasi raamistik, parallel parenting reeglid, NVC-skriptid ja</w:t>
+        <w:t xml:space="preserve">nelja faasi raamistik, parallel parenting reeglid,</w:t>
+      </w:r>
+      <w:r>
+        <w:t xml:space="preserve"> </w:t>
+      </w:r>
+      <w:r>
+        <w:rPr>
+          <w:bCs/>
+          <w:b/>
+        </w:rPr>
+        <w:t xml:space="preserve">DARVO selgitus</w:t>
+      </w:r>
+      <w:r>
+        <w:t xml:space="preserve">, NVC-skriptid ja</w:t>
       </w:r>
       <w:r>
         <w:t xml:space="preserve"> </w:t>
@@ -647,7 +660,904 @@
       </w:r>
     </w:p>
     <w:bookmarkEnd w:id="22"/>
-    <w:bookmarkStart w:id="23" w:name="olukorra-hinnang-andmete-põhjal"/>
+    <w:bookmarkStart w:id="26" w:name="darvo---mis-see-on-ja-miks-see-loeb-siin"/>
+    <w:p>
+      <w:pPr>
+        <w:pStyle w:val="Heading2"/>
+      </w:pPr>
+      <w:r>
+        <w:t xml:space="preserve">DARVO - mis see on (ja miks see loeb siin)</w:t>
+      </w:r>
+    </w:p>
+    <w:p>
+      <w:pPr>
+        <w:pStyle w:val="FirstParagraph"/>
+      </w:pPr>
+      <w:r>
+        <w:rPr>
+          <w:bCs/>
+          <w:b/>
+        </w:rPr>
+        <w:t xml:space="preserve">DARVO</w:t>
+      </w:r>
+      <w:r>
+        <w:t xml:space="preserve"> </w:t>
+      </w:r>
+      <w:r>
+        <w:t xml:space="preserve">on psühholoog</w:t>
+      </w:r>
+      <w:r>
+        <w:t xml:space="preserve"> </w:t>
+      </w:r>
+      <w:r>
+        <w:rPr>
+          <w:bCs/>
+          <w:b/>
+        </w:rPr>
+        <w:t xml:space="preserve">Jennifer Freyd</w:t>
+      </w:r>
+      <w:r>
+        <w:t xml:space="preserve"> </w:t>
+      </w:r>
+      <w:r>
+        <w:t xml:space="preserve">lühend (1997). See kirjeldab mustrit, kuidas inimene</w:t>
+      </w:r>
+      <w:r>
+        <w:t xml:space="preserve"> </w:t>
+      </w:r>
+      <w:r>
+        <w:rPr>
+          <w:bCs/>
+          <w:b/>
+        </w:rPr>
+        <w:t xml:space="preserve">vastutuse alt väljumiseks</w:t>
+      </w:r>
+      <w:r>
+        <w:t xml:space="preserve"> </w:t>
+      </w:r>
+      <w:r>
+        <w:t xml:space="preserve">sageli teeb kolm sammu järjest:</w:t>
+      </w:r>
+    </w:p>
+    <w:tbl>
+      <w:tblPr>
+        <w:tblStyle w:val="Table"/>
+        <w:tblW w:type="pct" w:w="5000"/>
+        <w:tblLook w:firstRow="1" w:lastRow="0" w:firstColumn="0" w:lastColumn="0" w:noHBand="0" w:noVBand="0" w:val="0020"/>
+        <w:jc w:val="start"/>
+      </w:tblPr>
+      <w:tblGrid>
+        <w:gridCol w:w="1159"/>
+        <w:gridCol w:w="3090"/>
+        <w:gridCol w:w="3670"/>
+      </w:tblGrid>
+      <w:tr>
+        <w:trPr>
+          <w:tblHeader w:val="true"/>
+        </w:trPr>
+        <w:tc>
+          <w:tcPr/>
+          <w:p>
+            <w:pPr>
+              <w:pStyle w:val="Compact"/>
+              <w:jc w:val="left"/>
+            </w:pPr>
+            <w:r>
+              <w:t xml:space="preserve">Samm</w:t>
+            </w:r>
+          </w:p>
+        </w:tc>
+        <w:tc>
+          <w:tcPr/>
+          <w:p>
+            <w:pPr>
+              <w:pStyle w:val="Compact"/>
+              <w:jc w:val="left"/>
+            </w:pPr>
+            <w:r>
+              <w:t xml:space="preserve">Inglise keeles</w:t>
+            </w:r>
+          </w:p>
+        </w:tc>
+        <w:tc>
+          <w:tcPr/>
+          <w:p>
+            <w:pPr>
+              <w:pStyle w:val="Compact"/>
+              <w:jc w:val="left"/>
+            </w:pPr>
+            <w:r>
+              <w:t xml:space="preserve">Mida see tähendab</w:t>
+            </w:r>
+          </w:p>
+        </w:tc>
+      </w:tr>
+      <w:tr>
+        <w:tc>
+          <w:tcPr/>
+          <w:p>
+            <w:pPr>
+              <w:pStyle w:val="Compact"/>
+              <w:jc w:val="left"/>
+            </w:pPr>
+            <w:r>
+              <w:rPr>
+                <w:bCs/>
+                <w:b/>
+              </w:rPr>
+              <w:t xml:space="preserve">D</w:t>
+            </w:r>
+          </w:p>
+        </w:tc>
+        <w:tc>
+          <w:tcPr/>
+          <w:p>
+            <w:pPr>
+              <w:pStyle w:val="Compact"/>
+              <w:jc w:val="left"/>
+            </w:pPr>
+            <w:r>
+              <w:rPr>
+                <w:bCs/>
+                <w:b/>
+              </w:rPr>
+              <w:t xml:space="preserve">Deny</w:t>
+            </w:r>
+            <w:r>
+              <w:t xml:space="preserve"> </w:t>
+            </w:r>
+            <w:r>
+              <w:t xml:space="preserve">(eitamine)</w:t>
+            </w:r>
+          </w:p>
+        </w:tc>
+        <w:tc>
+          <w:tcPr/>
+          <w:p>
+            <w:pPr>
+              <w:pStyle w:val="Compact"/>
+              <w:jc w:val="left"/>
+            </w:pPr>
+            <w:r>
+              <w:t xml:space="preserve">„Ma ei tegin seda.” / „Sa mõtled valesti.” / „See ei juhtus nii.”</w:t>
+            </w:r>
+          </w:p>
+        </w:tc>
+      </w:tr>
+      <w:tr>
+        <w:tc>
+          <w:tcPr/>
+          <w:p>
+            <w:pPr>
+              <w:pStyle w:val="Compact"/>
+              <w:jc w:val="left"/>
+            </w:pPr>
+            <w:r>
+              <w:rPr>
+                <w:bCs/>
+                <w:b/>
+              </w:rPr>
+              <w:t xml:space="preserve">A</w:t>
+            </w:r>
+          </w:p>
+        </w:tc>
+        <w:tc>
+          <w:tcPr/>
+          <w:p>
+            <w:pPr>
+              <w:pStyle w:val="Compact"/>
+              <w:jc w:val="left"/>
+            </w:pPr>
+            <w:r>
+              <w:rPr>
+                <w:bCs/>
+                <w:b/>
+              </w:rPr>
+              <w:t xml:space="preserve">Attack</w:t>
+            </w:r>
+            <w:r>
+              <w:t xml:space="preserve"> </w:t>
+            </w:r>
+            <w:r>
+              <w:t xml:space="preserve">(rünne)</w:t>
+            </w:r>
+          </w:p>
+        </w:tc>
+        <w:tc>
+          <w:tcPr/>
+          <w:p>
+            <w:pPr>
+              <w:pStyle w:val="Compact"/>
+              <w:jc w:val="left"/>
+            </w:pPr>
+            <w:r>
+              <w:t xml:space="preserve">Süüdistab vastu: „Sa oled hull / ohtlik / AI / manipuleerija.”</w:t>
+            </w:r>
+          </w:p>
+        </w:tc>
+      </w:tr>
+      <w:tr>
+        <w:tc>
+          <w:tcPr/>
+          <w:p>
+            <w:pPr>
+              <w:pStyle w:val="Compact"/>
+              <w:jc w:val="left"/>
+            </w:pPr>
+            <w:r>
+              <w:rPr>
+                <w:bCs/>
+                <w:b/>
+              </w:rPr>
+              <w:t xml:space="preserve">RVO</w:t>
+            </w:r>
+          </w:p>
+        </w:tc>
+        <w:tc>
+          <w:tcPr/>
+          <w:p>
+            <w:pPr>
+              <w:pStyle w:val="Compact"/>
+              <w:jc w:val="left"/>
+            </w:pPr>
+            <w:r>
+              <w:rPr>
+                <w:bCs/>
+                <w:b/>
+              </w:rPr>
+              <w:t xml:space="preserve">Reverse Victim and Offender</w:t>
+            </w:r>
+          </w:p>
+        </w:tc>
+        <w:tc>
+          <w:tcPr/>
+          <w:p>
+            <w:pPr>
+              <w:pStyle w:val="Compact"/>
+              <w:jc w:val="left"/>
+            </w:pPr>
+            <w:r>
+              <w:t xml:space="preserve">Pöördab rollid:</w:t>
+            </w:r>
+            <w:r>
+              <w:t xml:space="preserve"> </w:t>
+            </w:r>
+            <w:r>
+              <w:rPr>
+                <w:iCs/>
+                <w:i/>
+              </w:rPr>
+              <w:t xml:space="preserve">ta</w:t>
+            </w:r>
+            <w:r>
+              <w:t xml:space="preserve"> </w:t>
+            </w:r>
+            <w:r>
+              <w:t xml:space="preserve">on ohver,</w:t>
+            </w:r>
+            <w:r>
+              <w:t xml:space="preserve"> </w:t>
+            </w:r>
+            <w:r>
+              <w:rPr>
+                <w:iCs/>
+                <w:i/>
+              </w:rPr>
+              <w:t xml:space="preserve">sa</w:t>
+            </w:r>
+            <w:r>
+              <w:t xml:space="preserve"> </w:t>
+            </w:r>
+            <w:r>
+              <w:t xml:space="preserve">on süüdlane — „Sa võtsid lapse ära”, „Sa teed mulle haiget”, „Ma olen üksik ema, sina mind ründad.”</w:t>
+            </w:r>
+          </w:p>
+        </w:tc>
+      </w:tr>
+    </w:tbl>
+    <w:p>
+      <w:pPr>
+        <w:pStyle w:val="BodyText"/>
+      </w:pPr>
+      <w:r>
+        <w:rPr>
+          <w:bCs/>
+          <w:b/>
+        </w:rPr>
+        <w:t xml:space="preserve">Üks lause:</w:t>
+      </w:r>
+    </w:p>
+    <w:p>
+      <w:pPr>
+        <w:pStyle w:val="BlockText"/>
+      </w:pPr>
+      <w:r>
+        <w:t xml:space="preserve">Kui keegi tunneb, et tema tegu või piir on nähtavaks tulnud, võib ta</w:t>
+      </w:r>
+      <w:r>
+        <w:t xml:space="preserve"> </w:t>
+      </w:r>
+      <w:r>
+        <w:rPr>
+          <w:bCs/>
+          <w:b/>
+        </w:rPr>
+        <w:t xml:space="preserve">eitada</w:t>
+      </w:r>
+      <w:r>
+        <w:t xml:space="preserve">,</w:t>
+      </w:r>
+      <w:r>
+        <w:t xml:space="preserve"> </w:t>
+      </w:r>
+      <w:r>
+        <w:rPr>
+          <w:bCs/>
+          <w:b/>
+        </w:rPr>
+        <w:t xml:space="preserve">rünnata</w:t>
+      </w:r>
+      <w:r>
+        <w:t xml:space="preserve"> </w:t>
+      </w:r>
+      <w:r>
+        <w:t xml:space="preserve">ja</w:t>
+      </w:r>
+      <w:r>
+        <w:t xml:space="preserve"> </w:t>
+      </w:r>
+      <w:r>
+        <w:rPr>
+          <w:bCs/>
+          <w:b/>
+        </w:rPr>
+        <w:t xml:space="preserve">pöörata</w:t>
+      </w:r>
+      <w:r>
+        <w:t xml:space="preserve"> </w:t>
+      </w:r>
+      <w:r>
+        <w:t xml:space="preserve">nii, et tema tundub ohver ja teine süüdlane.</w:t>
+      </w:r>
+    </w:p>
+    <w:p>
+      <w:pPr>
+        <w:pStyle w:val="FirstParagraph"/>
+      </w:pPr>
+      <w:r>
+        <w:t xml:space="preserve">See ei on automaatne diagnoos. See on</w:t>
+      </w:r>
+      <w:r>
+        <w:t xml:space="preserve"> </w:t>
+      </w:r>
+      <w:r>
+        <w:rPr>
+          <w:bCs/>
+          <w:b/>
+        </w:rPr>
+        <w:t xml:space="preserve">muster</w:t>
+      </w:r>
+      <w:r>
+        <w:t xml:space="preserve">, mida saad</w:t>
+      </w:r>
+      <w:r>
+        <w:t xml:space="preserve"> </w:t>
+      </w:r>
+      <w:r>
+        <w:rPr>
+          <w:bCs/>
+          <w:b/>
+        </w:rPr>
+        <w:t xml:space="preserve">märkida</w:t>
+      </w:r>
+      <w:r>
+        <w:t xml:space="preserve"> </w:t>
+      </w:r>
+      <w:r>
+        <w:t xml:space="preserve">ja</w:t>
+      </w:r>
+      <w:r>
+        <w:t xml:space="preserve"> </w:t>
+      </w:r>
+      <w:r>
+        <w:rPr>
+          <w:bCs/>
+          <w:b/>
+        </w:rPr>
+        <w:t xml:space="preserve">dokumenteerida</w:t>
+      </w:r>
+      <w:r>
+        <w:t xml:space="preserve"> </w:t>
+      </w:r>
+      <w:r>
+        <w:t xml:space="preserve">— mitte reaalajas diagnoosida ega avalikult süüdistada.</w:t>
+      </w:r>
+    </w:p>
+    <w:bookmarkStart w:id="23" w:name="kuidas-see-võib-kõlada-co-parentingus"/>
+    <w:p>
+      <w:pPr>
+        <w:pStyle w:val="Heading3"/>
+      </w:pPr>
+      <w:r>
+        <w:t xml:space="preserve">Kuidas see võib kõlada co-parentingus</w:t>
+      </w:r>
+    </w:p>
+    <w:tbl>
+      <w:tblPr>
+        <w:tblStyle w:val="Table"/>
+        <w:tblW w:type="pct" w:w="5000"/>
+        <w:tblLook w:firstRow="1" w:lastRow="0" w:firstColumn="0" w:lastColumn="0" w:noHBand="0" w:noVBand="0" w:val="0020"/>
+        <w:jc w:val="start"/>
+      </w:tblPr>
+      <w:tblGrid>
+        <w:gridCol w:w="1584"/>
+        <w:gridCol w:w="6336"/>
+      </w:tblGrid>
+      <w:tr>
+        <w:trPr>
+          <w:tblHeader w:val="true"/>
+        </w:trPr>
+        <w:tc>
+          <w:tcPr/>
+          <w:p>
+            <w:pPr>
+              <w:pStyle w:val="Compact"/>
+              <w:jc w:val="left"/>
+            </w:pPr>
+            <w:r>
+              <w:t xml:space="preserve">Faas</w:t>
+            </w:r>
+          </w:p>
+        </w:tc>
+        <w:tc>
+          <w:tcPr/>
+          <w:p>
+            <w:pPr>
+              <w:pStyle w:val="Compact"/>
+              <w:jc w:val="left"/>
+            </w:pPr>
+            <w:r>
+              <w:t xml:space="preserve">Näide (illustratiivne)</w:t>
+            </w:r>
+          </w:p>
+        </w:tc>
+      </w:tr>
+      <w:tr>
+        <w:tc>
+          <w:tcPr/>
+          <w:p>
+            <w:pPr>
+              <w:pStyle w:val="Compact"/>
+              <w:jc w:val="left"/>
+            </w:pPr>
+            <w:r>
+              <w:rPr>
+                <w:bCs/>
+                <w:b/>
+              </w:rPr>
+              <w:t xml:space="preserve">D - eitamine</w:t>
+            </w:r>
+          </w:p>
+        </w:tc>
+        <w:tc>
+          <w:tcPr/>
+          <w:p>
+            <w:pPr>
+              <w:pStyle w:val="Compact"/>
+              <w:jc w:val="left"/>
+            </w:pPr>
+            <w:r>
+              <w:t xml:space="preserve">„Ma ei sea sulle tingimusi” (kui piir on just seatud) · „Ma ei ründasin”</w:t>
+            </w:r>
+          </w:p>
+        </w:tc>
+      </w:tr>
+      <w:tr>
+        <w:tc>
+          <w:tcPr/>
+          <w:p>
+            <w:pPr>
+              <w:pStyle w:val="Compact"/>
+              <w:jc w:val="left"/>
+            </w:pPr>
+            <w:r>
+              <w:rPr>
+                <w:bCs/>
+                <w:b/>
+              </w:rPr>
+              <w:t xml:space="preserve">A - rünne</w:t>
+            </w:r>
+          </w:p>
+        </w:tc>
+        <w:tc>
+          <w:tcPr/>
+          <w:p>
+            <w:pPr>
+              <w:pStyle w:val="Compact"/>
+              <w:jc w:val="left"/>
+            </w:pPr>
+            <w:r>
+              <w:t xml:space="preserve">„Sa oled AI” · „Sa oled ohtlik” · „Sa vajad teraapiat” · „Sa manipuleerid elatisega kontakti saamiseks”</w:t>
+            </w:r>
+          </w:p>
+        </w:tc>
+      </w:tr>
+      <w:tr>
+        <w:tc>
+          <w:tcPr/>
+          <w:p>
+            <w:pPr>
+              <w:pStyle w:val="Compact"/>
+              <w:jc w:val="left"/>
+            </w:pPr>
+            <w:r>
+              <w:rPr>
+                <w:bCs/>
+                <w:b/>
+              </w:rPr>
+              <w:t xml:space="preserve">RVO - rollide pööramine</w:t>
+            </w:r>
+          </w:p>
+        </w:tc>
+        <w:tc>
+          <w:tcPr/>
+          <w:p>
+            <w:pPr>
+              <w:pStyle w:val="Compact"/>
+              <w:jc w:val="left"/>
+            </w:pPr>
+            <w:r>
+              <w:t xml:space="preserve">„Sa võtsid lapse ära” · „Politsei / lapse kaitse aitab minul” · „Ma olen üksik, sina mind hülgad” · „Ma igatsen tõelist meest — sa oled vale versioon”</w:t>
+            </w:r>
+          </w:p>
+        </w:tc>
+      </w:tr>
+    </w:tbl>
+    <w:p>
+      <w:pPr>
+        <w:pStyle w:val="BodyText"/>
+      </w:pPr>
+      <w:r>
+        <w:rPr>
+          <w:bCs/>
+          <w:b/>
+        </w:rPr>
+        <w:t xml:space="preserve">Miks laps on siin kriitiline:</w:t>
+      </w:r>
+      <w:r>
+        <w:t xml:space="preserve"> </w:t>
+      </w:r>
+      <w:r>
+        <w:t xml:space="preserve">DARVO väljas ei jää ainult kahe täiskasvanu vahel. Laps</w:t>
+      </w:r>
+      <w:r>
+        <w:t xml:space="preserve"> </w:t>
+      </w:r>
+      <w:r>
+        <w:rPr>
+          <w:bCs/>
+          <w:b/>
+        </w:rPr>
+        <w:t xml:space="preserve">elab</w:t>
+      </w:r>
+      <w:r>
+        <w:t xml:space="preserve"> </w:t>
+      </w:r>
+      <w:r>
+        <w:t xml:space="preserve">emotsioonide väljas — eriti kui laps on kasutatud regulaatorina või kui narratiiv (ohver / ohtlik isa) kujuneb lapse ümber.</w:t>
+      </w:r>
+    </w:p>
+    <w:bookmarkEnd w:id="23"/>
+    <w:bookmarkStart w:id="24" w:name="sinu-pool-clean-up-raam"/>
+    <w:p>
+      <w:pPr>
+        <w:pStyle w:val="Heading3"/>
+      </w:pPr>
+      <w:r>
+        <w:t xml:space="preserve">Sinu pool (Clean-Up raam)</w:t>
+      </w:r>
+    </w:p>
+    <w:tbl>
+      <w:tblPr>
+        <w:tblStyle w:val="Table"/>
+        <w:tblW w:type="pct" w:w="5000"/>
+        <w:tblLook w:firstRow="1" w:lastRow="0" w:firstColumn="0" w:lastColumn="0" w:noHBand="0" w:noVBand="0" w:val="0020"/>
+        <w:jc w:val="start"/>
+      </w:tblPr>
+      <w:tblGrid>
+        <w:gridCol w:w="2828"/>
+        <w:gridCol w:w="5091"/>
+      </w:tblGrid>
+      <w:tr>
+        <w:trPr>
+          <w:tblHeader w:val="true"/>
+        </w:trPr>
+        <w:tc>
+          <w:tcPr/>
+          <w:p>
+            <w:pPr>
+              <w:pStyle w:val="Compact"/>
+              <w:jc w:val="left"/>
+            </w:pPr>
+            <w:r>
+              <w:t xml:space="preserve">Tee</w:t>
+            </w:r>
+          </w:p>
+        </w:tc>
+        <w:tc>
+          <w:tcPr/>
+          <w:p>
+            <w:pPr>
+              <w:pStyle w:val="Compact"/>
+              <w:jc w:val="left"/>
+            </w:pPr>
+            <w:r>
+              <w:t xml:space="preserve">Ära tee</w:t>
+            </w:r>
+          </w:p>
+        </w:tc>
+      </w:tr>
+      <w:tr>
+        <w:tc>
+          <w:tcPr/>
+          <w:p>
+            <w:pPr>
+              <w:pStyle w:val="Compact"/>
+              <w:jc w:val="left"/>
+            </w:pPr>
+            <w:r>
+              <w:rPr>
+                <w:bCs/>
+                <w:b/>
+              </w:rPr>
+              <w:t xml:space="preserve">Märgi muster</w:t>
+            </w:r>
+            <w:r>
+              <w:t xml:space="preserve"> </w:t>
+            </w:r>
+            <w:r>
+              <w:t xml:space="preserve">kirjas (kuupäev, lühike fakt, lapse fookus)</w:t>
+            </w:r>
+          </w:p>
+        </w:tc>
+        <w:tc>
+          <w:tcPr/>
+          <w:p>
+            <w:pPr>
+              <w:pStyle w:val="Compact"/>
+              <w:jc w:val="left"/>
+            </w:pPr>
+            <w:r>
+              <w:t xml:space="preserve">Ära ütle vestluses: „Sa teed DARVO”</w:t>
+            </w:r>
+          </w:p>
+        </w:tc>
+      </w:tr>
+      <w:tr>
+        <w:tc>
+          <w:tcPr/>
+          <w:p>
+            <w:pPr>
+              <w:pStyle w:val="Compact"/>
+              <w:jc w:val="left"/>
+            </w:pPr>
+            <w:r>
+              <w:rPr>
+                <w:bCs/>
+                <w:b/>
+              </w:rPr>
+              <w:t xml:space="preserve">Hoia raam</w:t>
+            </w:r>
+            <w:r>
+              <w:t xml:space="preserve"> </w:t>
+            </w:r>
+            <w:r>
+              <w:t xml:space="preserve">— praktiline vastus või stop</w:t>
+            </w:r>
+          </w:p>
+        </w:tc>
+        <w:tc>
+          <w:tcPr/>
+          <w:p>
+            <w:pPr>
+              <w:pStyle w:val="Compact"/>
+              <w:jc w:val="left"/>
+            </w:pPr>
+            <w:r>
+              <w:t xml:space="preserve">Ära lähe vasturünnakuks („sina ka…“)</w:t>
+            </w:r>
+          </w:p>
+        </w:tc>
+      </w:tr>
+      <w:tr>
+        <w:tc>
+          <w:tcPr/>
+          <w:p>
+            <w:pPr>
+              <w:pStyle w:val="Compact"/>
+              <w:jc w:val="left"/>
+            </w:pPr>
+            <w:r>
+              <w:rPr>
+                <w:bCs/>
+                <w:b/>
+              </w:rPr>
+              <w:t xml:space="preserve">Parallel parenting</w:t>
+            </w:r>
+            <w:r>
+              <w:t xml:space="preserve"> </w:t>
+            </w:r>
+            <w:r>
+              <w:t xml:space="preserve">— kirjalik, lapse fookus</w:t>
+            </w:r>
+          </w:p>
+        </w:tc>
+        <w:tc>
+          <w:tcPr/>
+          <w:p>
+            <w:pPr>
+              <w:pStyle w:val="Compact"/>
+              <w:jc w:val="left"/>
+            </w:pPr>
+            <w:r>
+              <w:t xml:space="preserve">Ära püüa „võita” tõe lahingut</w:t>
+            </w:r>
+          </w:p>
+        </w:tc>
+      </w:tr>
+      <w:tr>
+        <w:tc>
+          <w:tcPr/>
+          <w:p>
+            <w:pPr>
+              <w:pStyle w:val="Compact"/>
+              <w:jc w:val="left"/>
+            </w:pPr>
+            <w:r>
+              <w:rPr>
+                <w:bCs/>
+                <w:b/>
+              </w:rPr>
+              <w:t xml:space="preserve">Lisa Q</w:t>
+            </w:r>
+            <w:r>
+              <w:t xml:space="preserve"> </w:t>
+            </w:r>
+            <w:r>
+              <w:t xml:space="preserve">— NVC ilma süüdistuseta</w:t>
+            </w:r>
+          </w:p>
+        </w:tc>
+        <w:tc>
+          <w:tcPr/>
+          <w:p>
+            <w:pPr>
+              <w:pStyle w:val="Compact"/>
+              <w:jc w:val="left"/>
+            </w:pPr>
+            <w:r>
+              <w:t xml:space="preserve">Ära naerata / emoji piiri järel (Lisa AE, naeratuse märgid)</w:t>
+            </w:r>
+          </w:p>
+        </w:tc>
+      </w:tr>
+    </w:tbl>
+    <w:bookmarkEnd w:id="24"/>
+    <w:bookmarkStart w:id="25" w:name="faas-4-tingimus-ei-darvo-tähendab"/>
+    <w:p>
+      <w:pPr>
+        <w:pStyle w:val="Heading3"/>
+      </w:pPr>
+      <w:r>
+        <w:t xml:space="preserve">Faas 4 tingimus „Ei DARVO” tähendab</w:t>
+      </w:r>
+    </w:p>
+    <w:p>
+      <w:pPr>
+        <w:pStyle w:val="FirstParagraph"/>
+      </w:pPr>
+      <w:r>
+        <w:t xml:space="preserve">Enne uut lähenemist peab olema</w:t>
+      </w:r>
+      <w:r>
+        <w:t xml:space="preserve"> </w:t>
+      </w:r>
+      <w:r>
+        <w:rPr>
+          <w:bCs/>
+          <w:b/>
+        </w:rPr>
+        <w:t xml:space="preserve">mõõdetav muutus</w:t>
+      </w:r>
+      <w:r>
+        <w:t xml:space="preserve">: kui piir või vastutus tuleb teemaks, ei järgneb automaatselt rünnak + „ma olen ohver, sa oled süüdlane”. See on</w:t>
+      </w:r>
+      <w:r>
+        <w:t xml:space="preserve"> </w:t>
+      </w:r>
+      <w:r>
+        <w:rPr>
+          <w:bCs/>
+          <w:b/>
+        </w:rPr>
+        <w:t xml:space="preserve">käitumise</w:t>
+      </w:r>
+      <w:r>
+        <w:t xml:space="preserve"> </w:t>
+      </w:r>
+      <w:r>
+        <w:t xml:space="preserve">kriteerium — mitte üks „hea vestlus”.</w:t>
+      </w:r>
+    </w:p>
+    <w:p>
+      <w:pPr>
+        <w:pStyle w:val="BodyText"/>
+      </w:pPr>
+      <w:r>
+        <w:rPr>
+          <w:bCs/>
+          <w:b/>
+        </w:rPr>
+        <w:t xml:space="preserve">Seotud:</w:t>
+      </w:r>
+      <w:r>
+        <w:t xml:space="preserve"> </w:t>
+      </w:r>
+      <w:r>
+        <w:t xml:space="preserve">Lisa</w:t>
+      </w:r>
+      <w:r>
+        <w:t xml:space="preserve"> </w:t>
+      </w:r>
+      <w:r>
+        <w:rPr>
+          <w:bCs/>
+          <w:b/>
+        </w:rPr>
+        <w:t xml:space="preserve">P</w:t>
+      </w:r>
+      <w:r>
+        <w:t xml:space="preserve"> </w:t>
+      </w:r>
+      <w:r>
+        <w:t xml:space="preserve">(valideerimine — ära võta isiklikult, aga hoia piir), Lisa</w:t>
+      </w:r>
+      <w:r>
+        <w:t xml:space="preserve"> </w:t>
+      </w:r>
+      <w:r>
+        <w:rPr>
+          <w:bCs/>
+          <w:b/>
+        </w:rPr>
+        <w:t xml:space="preserve">S</w:t>
+      </w:r>
+      <w:r>
+        <w:t xml:space="preserve"> </w:t>
+      </w:r>
+      <w:r>
+        <w:t xml:space="preserve">(trauma — keha kaitsepositsioonis reageerib kiiremini), Lisa</w:t>
+      </w:r>
+      <w:r>
+        <w:t xml:space="preserve"> </w:t>
+      </w:r>
+      <w:r>
+        <w:rPr>
+          <w:bCs/>
+          <w:b/>
+        </w:rPr>
+        <w:t xml:space="preserve">Q</w:t>
+      </w:r>
+      <w:r>
+        <w:t xml:space="preserve"> </w:t>
+      </w:r>
+      <w:r>
+        <w:t xml:space="preserve">(austav keel ilma dominantsita).</w:t>
+      </w:r>
+    </w:p>
+    <w:bookmarkEnd w:id="25"/>
+    <w:bookmarkEnd w:id="26"/>
+    <w:bookmarkStart w:id="27" w:name="olukorra-hinnang-andmete-põhjal"/>
     <w:p>
       <w:pPr>
         <w:pStyle w:val="Heading2"/>
@@ -1007,8 +1917,8 @@
         </w:pict>
       </w:r>
     </w:p>
-    <w:bookmarkEnd w:id="23"/>
-    <w:bookmarkStart w:id="28" w:name="põhiülesanne---neli-faasi"/>
+    <w:bookmarkEnd w:id="27"/>
+    <w:bookmarkStart w:id="32" w:name="põhiülesanne---neli-faasi"/>
     <w:p>
       <w:pPr>
         <w:pStyle w:val="Heading2"/>
@@ -1017,7 +1927,7 @@
         <w:t xml:space="preserve">2. Põhiülesanne - neli faasi</w:t>
       </w:r>
     </w:p>
-    <w:bookmarkStart w:id="24" w:name="X69c315ae68be825dbd3a78558a57e0b5d6882b7"/>
+    <w:bookmarkStart w:id="28" w:name="X69c315ae68be825dbd3a78558a57e0b5d6882b7"/>
     <w:p>
       <w:pPr>
         <w:pStyle w:val="Heading3"/>
@@ -1273,8 +2183,8 @@
         </w:tc>
       </w:tr>
     </w:tbl>
-    <w:bookmarkEnd w:id="24"/>
-    <w:bookmarkStart w:id="25" w:name="faas-2---trauma-töö-3-9-kuud"/>
+    <w:bookmarkEnd w:id="28"/>
+    <w:bookmarkStart w:id="29" w:name="faas-2---trauma-töö-3-9-kuud"/>
     <w:p>
       <w:pPr>
         <w:pStyle w:val="Heading3"/>
@@ -1385,8 +2295,8 @@
         <w:t xml:space="preserve">ja sageli kahjulik selles faasis. Individuaalne töö esmalt.</w:t>
       </w:r>
     </w:p>
-    <w:bookmarkEnd w:id="25"/>
-    <w:bookmarkStart w:id="26" w:name="faas-3---võimekuse-ehitus-tema-pool"/>
+    <w:bookmarkEnd w:id="29"/>
+    <w:bookmarkStart w:id="30" w:name="faas-3---võimekuse-ehitus-tema-pool"/>
     <w:p>
       <w:pPr>
         <w:pStyle w:val="Heading3"/>
@@ -1477,8 +2387,8 @@
         <w:t xml:space="preserve">et laps või sa oleksid väline regulaator</w:t>
       </w:r>
     </w:p>
-    <w:bookmarkEnd w:id="26"/>
-    <w:bookmarkStart w:id="27" w:name="Xaa35cb2bc75b8ca39333466bf62c6f9f86d64c5"/>
+    <w:bookmarkEnd w:id="30"/>
+    <w:bookmarkStart w:id="31" w:name="Xaa35cb2bc75b8ca39333466bf62c6f9f86d64c5"/>
     <w:p>
       <w:pPr>
         <w:pStyle w:val="Heading3"/>
@@ -1592,9 +2502,9 @@
         </w:pict>
       </w:r>
     </w:p>
-    <w:bookmarkEnd w:id="27"/>
-    <w:bookmarkEnd w:id="28"/>
-    <w:bookmarkStart w:id="29" w:name="X692efe4fc1d55603c2c2cc27506185a55b8b965"/>
+    <w:bookmarkEnd w:id="31"/>
+    <w:bookmarkEnd w:id="32"/>
+    <w:bookmarkStart w:id="33" w:name="X692efe4fc1d55603c2c2cc27506185a55b8b965"/>
     <w:p>
       <w:pPr>
         <w:pStyle w:val="Heading2"/>
@@ -1831,8 +2741,8 @@
         </w:pict>
       </w:r>
     </w:p>
-    <w:bookmarkEnd w:id="29"/>
-    <w:bookmarkStart w:id="31" w:name="kohe-teha-24-72-h"/>
+    <w:bookmarkEnd w:id="33"/>
+    <w:bookmarkStart w:id="35" w:name="kohe-teha-24-72-h"/>
     <w:p>
       <w:pPr>
         <w:pStyle w:val="Heading2"/>
@@ -2143,7 +3053,7 @@
         </w:tc>
       </w:tr>
     </w:tbl>
-    <w:bookmarkStart w:id="30" w:name="ära-tee"/>
+    <w:bookmarkStart w:id="34" w:name="ära-tee"/>
     <w:p>
       <w:pPr>
         <w:pStyle w:val="Heading3"/>
@@ -2231,9 +3141,9 @@
         </w:pict>
       </w:r>
     </w:p>
-    <w:bookmarkEnd w:id="30"/>
-    <w:bookmarkEnd w:id="31"/>
-    <w:bookmarkStart w:id="35" w:name="side---nvc-skriptid-lisa-q-täiendus"/>
+    <w:bookmarkEnd w:id="34"/>
+    <w:bookmarkEnd w:id="35"/>
+    <w:bookmarkStart w:id="39" w:name="side---nvc-skriptid-lisa-q-täiendus"/>
     <w:p>
       <w:pPr>
         <w:pStyle w:val="Heading2"/>
@@ -2242,7 +3152,7 @@
         <w:t xml:space="preserve">5. Side - NVC skriptid (Lisa Q täiendus)</w:t>
       </w:r>
     </w:p>
-    <w:bookmarkStart w:id="32" w:name="elatis---kui-ta-küsib-konkreetselt"/>
+    <w:bookmarkStart w:id="36" w:name="elatis---kui-ta-küsib-konkreetselt"/>
     <w:p>
       <w:pPr>
         <w:pStyle w:val="Heading3"/>
@@ -2293,8 +3203,8 @@
         <w:t xml:space="preserve">Ütle mulle, mis summa ja mis ajagraafik sulle praegu majanduslikult hingamisruumi annaks - siis saan ma selle peale konkreetse vastuse anda.</w:t>
       </w:r>
     </w:p>
-    <w:bookmarkEnd w:id="32"/>
-    <w:bookmarkStart w:id="33" w:name="kui-vestlus-läheb-narratiivi"/>
+    <w:bookmarkEnd w:id="36"/>
+    <w:bookmarkStart w:id="37" w:name="kui-vestlus-läheb-narratiivi"/>
     <w:p>
       <w:pPr>
         <w:pStyle w:val="Heading3"/>
@@ -2375,8 +3285,8 @@
         <w:t xml:space="preserve">- mitte üks sõna rohkem.</w:t>
       </w:r>
     </w:p>
-    <w:bookmarkEnd w:id="33"/>
-    <w:bookmarkStart w:id="34" w:name="gotwa-enne-lapsega-seotud-kohtumist"/>
+    <w:bookmarkEnd w:id="37"/>
+    <w:bookmarkStart w:id="38" w:name="gotwa-enne-lapsega-seotud-kohtumist"/>
     <w:p>
       <w:pPr>
         <w:pStyle w:val="Heading3"/>
@@ -2534,9 +3444,9 @@
         </w:pict>
       </w:r>
     </w:p>
-    <w:bookmarkEnd w:id="34"/>
-    <w:bookmarkEnd w:id="35"/>
-    <w:bookmarkStart w:id="36" w:name="naeratuse-märgid---õppetund"/>
+    <w:bookmarkEnd w:id="38"/>
+    <w:bookmarkEnd w:id="39"/>
+    <w:bookmarkStart w:id="40" w:name="naeratuse-märgid---õppetund"/>
     <w:p>
       <w:pPr>
         <w:pStyle w:val="Heading2"/>
@@ -2865,8 +3775,8 @@
         </w:pict>
       </w:r>
     </w:p>
-    <w:bookmarkEnd w:id="36"/>
-    <w:bookmarkStart w:id="37" w:name="tsükkel---mida-sa-kontrollid"/>
+    <w:bookmarkEnd w:id="40"/>
+    <w:bookmarkStart w:id="41" w:name="tsükkel---mida-sa-kontrollid"/>
     <w:p>
       <w:pPr>
         <w:pStyle w:val="Heading2"/>
@@ -2952,8 +3862,8 @@
         </w:pict>
       </w:r>
     </w:p>
-    <w:bookmarkEnd w:id="37"/>
-    <w:bookmarkStart w:id="38" w:name="X23dfe6bd143f4a26d549d9c955c42da825251fe"/>
+    <w:bookmarkEnd w:id="41"/>
+    <w:bookmarkStart w:id="42" w:name="X23dfe6bd143f4a26d549d9c955c42da825251fe"/>
     <w:p>
       <w:pPr>
         <w:pStyle w:val="Heading2"/>
@@ -3132,8 +4042,8 @@
         </w:pict>
       </w:r>
     </w:p>
-    <w:bookmarkEnd w:id="38"/>
-    <w:bookmarkStart w:id="39" w:name="kiht-ja-levitamine"/>
+    <w:bookmarkEnd w:id="42"/>
+    <w:bookmarkStart w:id="43" w:name="kiht-ja-levitamine"/>
     <w:p>
       <w:pPr>
         <w:pStyle w:val="Heading2"/>
@@ -3337,8 +4247,8 @@
         </w:pict>
       </w:r>
     </w:p>
-    <w:bookmarkEnd w:id="39"/>
-    <w:bookmarkStart w:id="40" w:name="seotud-lisad"/>
+    <w:bookmarkEnd w:id="43"/>
+    <w:bookmarkStart w:id="44" w:name="seotud-lisad"/>
     <w:p>
       <w:pPr>
         <w:pStyle w:val="Heading2"/>
@@ -3689,8 +4599,8 @@
         </w:pict>
       </w:r>
     </w:p>
-    <w:bookmarkEnd w:id="40"/>
-    <w:bookmarkStart w:id="41" w:name="üks-tegu-täna"/>
+    <w:bookmarkEnd w:id="44"/>
+    <w:bookmarkStart w:id="45" w:name="üks-tegu-täna"/>
     <w:p>
       <w:pPr>
         <w:pStyle w:val="Heading2"/>
@@ -3803,8 +4713,8 @@
         <w:t xml:space="preserve">Eesti rahvale - see konkreetne lisa on isiklik juhtimisdokument, mitte avalik levitus.</w:t>
       </w:r>
     </w:p>
-    <w:bookmarkEnd w:id="41"/>
-    <w:bookmarkEnd w:id="42"/>
+    <w:bookmarkEnd w:id="45"/>
+    <w:bookmarkEnd w:id="46"/>
     <w:sectPr/>
   </w:body>
 </w:document>

</xml_diff>